<commit_message>
Rename Erwin project folders and move generated outputs
</commit_message>
<xml_diff>
--- a/Erwin_s4g_image_downloader/documentation/S4G_Image_Workflow_Documentation.docx
+++ b/Erwin_s4g_image_downloader/documentation/S4G_Image_Workflow_Documentation.docx
@@ -287,7 +287,7 @@
                 <w:b w:val="0"/>
                 <w:sz w:val="19"/>
               </w:rPr>
-              <w:t>s4g_image_downloader\geometry_output\s4g_image_geometry_manifest.csv</w:t>
+              <w:t>Erwin_s4g_image_downloader\geometry_output\s4g_image_geometry_manifest.csv</w:t>
             </w:r>
           </w:p>
         </w:tc>
@@ -1988,7 +1988,7 @@
         <w:spacing w:after="120"/>
       </w:pPr>
       <w:r>
-        <w:t>Purpose: download S4G 3.6 micron FITS images from IRSA for the galaxies listed in barprofiles_paper_GB_working_copy\data\scrambled_map.txt.</w:t>
+        <w:t>Purpose: download S4G 3.6 micron FITS images from IRSA for the galaxies listed in Erwin_barprofiles_paper_GB_working_copy\data\scrambled_map.txt.</w:t>
       </w:r>
     </w:p>
     <w:p>
@@ -1996,7 +1996,7 @@
         <w:pStyle w:val="ListBullet"/>
       </w:pPr>
       <w:r>
-        <w:t>Default input: barprofiles_paper_GB_working_copy\data\scrambled_map.txt.</w:t>
+        <w:t>Default input: Erwin_barprofiles_paper_GB_working_copy\data\scrambled_map.txt.</w:t>
       </w:r>
     </w:p>
     <w:p>
@@ -2157,7 +2157,7 @@
         <w:pStyle w:val="ListBullet"/>
       </w:pPr>
       <w:r>
-        <w:t>Default manifest output: s4g_image_downloader\geometry_output\s4g_image_geometry_manifest.csv.</w:t>
+        <w:t>Default manifest output: Erwin_s4g_image_downloader\geometry_output\s4g_image_geometry_manifest.csv.</w:t>
       </w:r>
     </w:p>
     <w:p>
@@ -2165,7 +2165,7 @@
         <w:pStyle w:val="ListBullet"/>
       </w:pPr>
       <w:r>
-        <w:t>Default cache folder: s4g_image_downloader\geometry_catalog_cache.</w:t>
+        <w:t>Default cache folder: Erwin_s4g_image_downloader\geometry_catalog_cache.</w:t>
       </w:r>
     </w:p>
     <w:p>
@@ -2310,7 +2310,7 @@
         <w:pStyle w:val="ListBullet"/>
       </w:pPr>
       <w:r>
-        <w:t>Default manifest: s4g_image_downloader\geometry_output\s4g_image_geometry_manifest.csv.</w:t>
+        <w:t>Default manifest: Erwin_s4g_image_downloader\geometry_output\s4g_image_geometry_manifest.csv.</w:t>
       </w:r>
     </w:p>
     <w:p>

</xml_diff>